<commit_message>
refactor: Decision Logs are updated based on feedbacks and research
</commit_message>
<xml_diff>
--- a/Decision Logs/Decision-log-2-Model-decision(First-Version).docx
+++ b/Decision Logs/Decision-log-2-Model-decision(First-Version).docx
@@ -5,69 +5,57 @@
     <w:p>
       <w:pPr>
         <w:pStyle w:val="Heading1"/>
-        <w:rPr>
-          <w:lang w:val="en-GB"/>
-        </w:rPr>
-      </w:pPr>
-      <w:r>
-        <w:rPr>
-          <w:lang w:val="en-GB"/>
-        </w:rPr>
-        <w:t>Decision Log</w:t>
+        <w:pBdr>
+          <w:bottom w:val="single" w:sz="6" w:space="1" w:color="auto"/>
+        </w:pBdr>
+        <w:rPr>
+          <w:sz w:val="44"/>
+          <w:szCs w:val="44"/>
+          <w:lang w:val="en-GB"/>
+        </w:rPr>
+      </w:pPr>
+      <w:r>
+        <w:rPr>
+          <w:sz w:val="44"/>
+          <w:szCs w:val="44"/>
+          <w:lang w:val="en-GB"/>
+        </w:rPr>
+        <w:t xml:space="preserve">Decision Log </w:t>
+      </w:r>
+      <w:r>
+        <w:rPr>
+          <w:sz w:val="44"/>
+          <w:szCs w:val="44"/>
+          <w:lang w:val="en-GB"/>
+        </w:rPr>
+        <w:t>– 2</w:t>
       </w:r>
     </w:p>
     <w:p>
       <w:pPr>
-        <w:pStyle w:val="Heading2"/>
-        <w:rPr>
-          <w:lang w:val="en-GB"/>
-        </w:rPr>
-      </w:pPr>
-      <w:r>
-        <w:rPr>
-          <w:lang w:val="en-GB"/>
-        </w:rPr>
-        <w:t>0. Context – Why does this question exist?</w:t>
-      </w:r>
-      <w:r>
-        <w:rPr>
-          <w:lang w:val="en-GB"/>
-        </w:rPr>
-        <w:br/>
-      </w:r>
+        <w:rPr>
+          <w:lang w:val="en-GB"/>
+        </w:rPr>
+      </w:pPr>
     </w:p>
     <w:p>
       <w:pPr>
-        <w:rPr>
-          <w:lang w:val="en-GB"/>
-        </w:rPr>
-      </w:pPr>
-      <w:r>
-        <w:rPr>
-          <w:rStyle w:val="Heading3Char"/>
-          <w:lang w:val="en-GB"/>
-        </w:rPr>
-        <w:t>Project / assignment this belongs to</w:t>
+        <w:pStyle w:val="Heading2"/>
+        <w:rPr>
+          <w:lang w:val="en-GB"/>
+        </w:rPr>
+      </w:pPr>
+      <w:r>
+        <w:rPr>
+          <w:lang w:val="en-GB"/>
+        </w:rPr>
+        <w:t>0. Context – Why does this question exist?</w:t>
       </w:r>
       <w:r>
         <w:rPr>
           <w:lang w:val="en-GB"/>
         </w:rPr>
         <w:br/>
-      </w:r>
-      <w:proofErr w:type="spellStart"/>
-      <w:r>
-        <w:rPr>
-          <w:lang w:val="en-GB"/>
-        </w:rPr>
-        <w:t>StackEval</w:t>
-      </w:r>
-      <w:proofErr w:type="spellEnd"/>
-      <w:r>
-        <w:rPr>
-          <w:lang w:val="en-GB"/>
-        </w:rPr>
-        <w:t xml:space="preserve"> Benchmark – Professional Research Project</w:t>
       </w:r>
     </w:p>
     <w:p>
@@ -78,10 +66,56 @@
       </w:pPr>
       <w:r>
         <w:rPr>
-          <w:rStyle w:val="Heading3Char"/>
-          <w:lang w:val="en-GB"/>
+          <w:b/>
+          <w:bCs/>
+        </w:rPr>
+        <w:t>Project / assignment this belongs to</w:t>
+      </w:r>
+      <w:r>
+        <w:rPr>
+          <w:lang w:val="en-GB"/>
+        </w:rPr>
+        <w:t>:</w:t>
+      </w:r>
+      <w:r>
+        <w:rPr>
+          <w:lang w:val="en-GB"/>
+        </w:rPr>
+        <w:br/>
+      </w:r>
+      <w:proofErr w:type="spellStart"/>
+      <w:r>
+        <w:rPr>
+          <w:lang w:val="en-GB"/>
+        </w:rPr>
+        <w:t>StackEval</w:t>
+      </w:r>
+      <w:proofErr w:type="spellEnd"/>
+      <w:r>
+        <w:rPr>
+          <w:lang w:val="en-GB"/>
+        </w:rPr>
+        <w:t xml:space="preserve"> Benchmark – Professional Research Project</w:t>
+      </w:r>
+    </w:p>
+    <w:p>
+      <w:pPr>
+        <w:rPr>
+          <w:lang w:val="en-GB"/>
+        </w:rPr>
+      </w:pPr>
+      <w:r>
+        <w:rPr>
+          <w:b/>
+          <w:bCs/>
         </w:rPr>
         <w:t>Why this matters right now</w:t>
+      </w:r>
+      <w:r>
+        <w:rPr>
+          <w:lang w:val="en-GB"/>
+        </w:rPr>
+        <w:t>:</w:t>
       </w:r>
       <w:r>
         <w:rPr>
@@ -113,10 +147,16 @@
       </w:pPr>
       <w:r>
         <w:rPr>
-          <w:rStyle w:val="Heading3Char"/>
-          <w:lang w:val="en-GB"/>
+          <w:b/>
+          <w:bCs/>
         </w:rPr>
         <w:t>Where this fits</w:t>
+      </w:r>
+      <w:r>
+        <w:rPr>
+          <w:lang w:val="en-GB"/>
+        </w:rPr>
+        <w:t>:</w:t>
       </w:r>
       <w:r>
         <w:rPr>
@@ -150,7 +190,7 @@
           <w:lang w:val="en-GB"/>
         </w:rPr>
         <w:pict w14:anchorId="344A6C0B">
-          <v:rect id="_x0000_i1295" style="width:0;height:1.5pt" o:hralign="center" o:hrstd="t" o:hr="t" fillcolor="#a0a0a0" stroked="f"/>
+          <v:rect id="_x0000_i1025" style="width:0;height:1.5pt" o:hralign="center" o:hrstd="t" o:hr="t" fillcolor="#a0a0a0" stroked="f"/>
         </w:pict>
       </w:r>
     </w:p>
@@ -206,7 +246,7 @@
           <w:lang w:val="en-GB"/>
         </w:rPr>
         <w:pict w14:anchorId="261FA822">
-          <v:rect id="_x0000_i1296" style="width:0;height:1.5pt" o:hralign="center" o:hrstd="t" o:hr="t" fillcolor="#a0a0a0" stroked="f"/>
+          <v:rect id="_x0000_i1026" style="width:0;height:1.5pt" o:hralign="center" o:hrstd="t" o:hr="t" fillcolor="#a0a0a0" stroked="f"/>
         </w:pict>
       </w:r>
     </w:p>
@@ -349,7 +389,7 @@
           <w:lang w:val="en-GB"/>
         </w:rPr>
         <w:pict w14:anchorId="2781D46E">
-          <v:rect id="_x0000_i1297" style="width:0;height:1.5pt" o:hralign="center" o:hrstd="t" o:hr="t" fillcolor="#a0a0a0" stroked="f"/>
+          <v:rect id="_x0000_i1027" style="width:0;height:1.5pt" o:hralign="center" o:hrstd="t" o:hr="t" fillcolor="#a0a0a0" stroked="f"/>
         </w:pict>
       </w:r>
     </w:p>
@@ -477,7 +517,7 @@
           <w:lang w:val="en-GB"/>
         </w:rPr>
         <w:pict w14:anchorId="3ABF3CA7">
-          <v:rect id="_x0000_i1298" style="width:0;height:1.5pt" o:hralign="center" o:hrstd="t" o:hr="t" fillcolor="#a0a0a0" stroked="f"/>
+          <v:rect id="_x0000_i1028" style="width:0;height:1.5pt" o:hralign="center" o:hrstd="t" o:hr="t" fillcolor="#a0a0a0" stroked="f"/>
         </w:pict>
       </w:r>
     </w:p>
@@ -638,7 +678,7 @@
           <w:lang w:val="en-GB"/>
         </w:rPr>
         <w:pict w14:anchorId="5586B174">
-          <v:rect id="_x0000_i1299" style="width:0;height:1.5pt" o:hralign="center" o:hrstd="t" o:hr="t" fillcolor="#a0a0a0" stroked="f"/>
+          <v:rect id="_x0000_i1029" style="width:0;height:1.5pt" o:hralign="center" o:hrstd="t" o:hr="t" fillcolor="#a0a0a0" stroked="f"/>
         </w:pict>
       </w:r>
     </w:p>
@@ -658,13 +698,16 @@
     </w:p>
     <w:p>
       <w:pPr>
-        <w:pStyle w:val="Heading3"/>
-        <w:rPr>
-          <w:lang w:val="en-GB"/>
-        </w:rPr>
-      </w:pPr>
-      <w:r>
-        <w:rPr>
+        <w:rPr>
+          <w:b/>
+          <w:bCs/>
+          <w:lang w:val="en-GB"/>
+        </w:rPr>
+      </w:pPr>
+      <w:r>
+        <w:rPr>
+          <w:b/>
+          <w:bCs/>
           <w:lang w:val="en-GB"/>
         </w:rPr>
         <w:t>Method Used</w:t>
@@ -700,15 +743,24 @@
         <w:rPr>
           <w:b/>
           <w:bCs/>
-          <w:lang w:val="en-GB"/>
-        </w:rPr>
-        <w:t>exploratory research</w:t>
-      </w:r>
-      <w:r>
-        <w:rPr>
-          <w:lang w:val="en-GB"/>
-        </w:rPr>
-        <w:t xml:space="preserve"> were used to </w:t>
+          <w:u w:val="single"/>
+          <w:lang w:val="en-GB"/>
+        </w:rPr>
+        <w:t>Literature study methodology</w:t>
+      </w:r>
+      <w:r>
+        <w:rPr>
+          <w:b/>
+          <w:bCs/>
+          <w:lang w:val="en-GB"/>
+        </w:rPr>
+        <w:t xml:space="preserve"> </w:t>
+      </w:r>
+      <w:r>
+        <w:rPr>
+          <w:lang w:val="en-GB"/>
+        </w:rPr>
+        <w:t xml:space="preserve">were used to </w:t>
       </w:r>
       <w:proofErr w:type="spellStart"/>
       <w:r>
@@ -736,19 +788,22 @@
           <w:lang w:val="en-GB"/>
         </w:rPr>
         <w:pict w14:anchorId="2B52805D">
-          <v:rect id="_x0000_i1300" style="width:0;height:1.5pt" o:hralign="center" o:hrstd="t" o:hr="t" fillcolor="#a0a0a0" stroked="f"/>
+          <v:rect id="_x0000_i1030" style="width:0;height:1.5pt" o:hralign="center" o:hrstd="t" o:hr="t" fillcolor="#a0a0a0" stroked="f"/>
         </w:pict>
       </w:r>
     </w:p>
     <w:p>
       <w:pPr>
-        <w:pStyle w:val="Heading3"/>
-        <w:rPr>
-          <w:lang w:val="en-GB"/>
-        </w:rPr>
-      </w:pPr>
-      <w:r>
-        <w:rPr>
+        <w:rPr>
+          <w:b/>
+          <w:bCs/>
+          <w:lang w:val="en-GB"/>
+        </w:rPr>
+      </w:pPr>
+      <w:r>
+        <w:rPr>
+          <w:b/>
+          <w:bCs/>
           <w:lang w:val="en-GB"/>
         </w:rPr>
         <w:t>Observations</w:t>
@@ -909,7 +964,7 @@
           <w:lang w:val="en-GB"/>
         </w:rPr>
         <w:pict w14:anchorId="171345BB">
-          <v:rect id="_x0000_i1301" style="width:0;height:1.5pt" o:hralign="center" o:hrstd="t" o:hr="t" fillcolor="#a0a0a0" stroked="f"/>
+          <v:rect id="_x0000_i1031" style="width:0;height:1.5pt" o:hralign="center" o:hrstd="t" o:hr="t" fillcolor="#a0a0a0" stroked="f"/>
         </w:pict>
       </w:r>
     </w:p>
@@ -966,21 +1021,7 @@
             <w:rStyle w:val="Hyperlink"/>
             <w:lang w:val="en-GB"/>
           </w:rPr>
-          <w:t>https://chatgpt.com/share/69b7f668-b368-8002</w:t>
-        </w:r>
-        <w:r>
-          <w:rPr>
-            <w:rStyle w:val="Hyperlink"/>
-            <w:lang w:val="en-GB"/>
-          </w:rPr>
-          <w:t>-</w:t>
-        </w:r>
-        <w:r>
-          <w:rPr>
-            <w:rStyle w:val="Hyperlink"/>
-            <w:lang w:val="en-GB"/>
-          </w:rPr>
-          <w:t>90b6-d4634e666ecd</w:t>
+          <w:t>https://chatgpt.com/share/69b7f668-b368-8002-90b6-d4634e666ecd</w:t>
         </w:r>
       </w:hyperlink>
     </w:p>
@@ -1006,6 +1047,7 @@
       </w:pPr>
       <w:r>
         <w:rPr>
+          <w:noProof/>
           <w:lang w:val="en-GB"/>
         </w:rPr>
         <w:drawing>
@@ -1065,19 +1107,22 @@
           <w:lang w:val="en-GB"/>
         </w:rPr>
         <w:pict w14:anchorId="5966D785">
-          <v:rect id="_x0000_i1302" style="width:0;height:1.5pt" o:hralign="center" o:hrstd="t" o:hr="t" fillcolor="#a0a0a0" stroked="f"/>
+          <v:rect id="_x0000_i1032" style="width:0;height:1.5pt" o:hralign="center" o:hrstd="t" o:hr="t" fillcolor="#a0a0a0" stroked="f"/>
         </w:pict>
       </w:r>
     </w:p>
     <w:p>
       <w:pPr>
-        <w:pStyle w:val="Heading3"/>
-        <w:rPr>
-          <w:lang w:val="en-GB"/>
-        </w:rPr>
-      </w:pPr>
-      <w:r>
-        <w:rPr>
+        <w:rPr>
+          <w:b/>
+          <w:bCs/>
+          <w:lang w:val="en-GB"/>
+        </w:rPr>
+      </w:pPr>
+      <w:r>
+        <w:rPr>
+          <w:b/>
+          <w:bCs/>
           <w:lang w:val="en-GB"/>
         </w:rPr>
         <w:t>Interpretation</w:t>
@@ -1171,19 +1216,22 @@
           <w:lang w:val="en-GB"/>
         </w:rPr>
         <w:pict w14:anchorId="5966F92F">
-          <v:rect id="_x0000_i1303" style="width:0;height:1.5pt" o:hralign="center" o:hrstd="t" o:hr="t" fillcolor="#a0a0a0" stroked="f"/>
+          <v:rect id="_x0000_i1033" style="width:0;height:1.5pt" o:hralign="center" o:hrstd="t" o:hr="t" fillcolor="#a0a0a0" stroked="f"/>
         </w:pict>
       </w:r>
     </w:p>
     <w:p>
       <w:pPr>
-        <w:pStyle w:val="Heading3"/>
-        <w:rPr>
-          <w:lang w:val="en-GB"/>
-        </w:rPr>
-      </w:pPr>
-      <w:r>
-        <w:rPr>
+        <w:rPr>
+          <w:b/>
+          <w:bCs/>
+          <w:lang w:val="en-GB"/>
+        </w:rPr>
+      </w:pPr>
+      <w:r>
+        <w:rPr>
+          <w:b/>
+          <w:bCs/>
           <w:lang w:val="en-GB"/>
         </w:rPr>
         <w:t>Final Decision</w:t>
@@ -1213,7 +1261,7 @@
           <w:lang w:val="en-GB"/>
         </w:rPr>
         <w:pict w14:anchorId="5E72612E">
-          <v:rect id="_x0000_i1304" style="width:0;height:1.5pt" o:hralign="center" o:hrstd="t" o:hr="t" fillcolor="#a0a0a0" stroked="f"/>
+          <v:rect id="_x0000_i1034" style="width:0;height:1.5pt" o:hralign="center" o:hrstd="t" o:hr="t" fillcolor="#a0a0a0" stroked="f"/>
         </w:pict>
       </w:r>
     </w:p>
@@ -1392,19 +1440,22 @@
           <w:lang w:val="en-GB"/>
         </w:rPr>
         <w:pict w14:anchorId="65070B22">
-          <v:rect id="_x0000_i1305" style="width:0;height:1.5pt" o:hralign="center" o:hrstd="t" o:hr="t" fillcolor="#a0a0a0" stroked="f"/>
+          <v:rect id="_x0000_i1035" style="width:0;height:1.5pt" o:hralign="center" o:hrstd="t" o:hr="t" fillcolor="#a0a0a0" stroked="f"/>
         </w:pict>
       </w:r>
     </w:p>
     <w:p>
       <w:pPr>
-        <w:pStyle w:val="Heading3"/>
-        <w:rPr>
-          <w:lang w:val="en-GB"/>
-        </w:rPr>
-      </w:pPr>
-      <w:r>
-        <w:rPr>
+        <w:rPr>
+          <w:b/>
+          <w:bCs/>
+          <w:lang w:val="en-GB"/>
+        </w:rPr>
+      </w:pPr>
+      <w:r>
+        <w:rPr>
+          <w:b/>
+          <w:bCs/>
           <w:lang w:val="en-GB"/>
         </w:rPr>
         <w:t>Assumptions</w:t>
@@ -1434,19 +1485,22 @@
           <w:lang w:val="en-GB"/>
         </w:rPr>
         <w:pict w14:anchorId="5A4306FE">
-          <v:rect id="_x0000_i1306" style="width:0;height:1.5pt" o:hralign="center" o:hrstd="t" o:hr="t" fillcolor="#a0a0a0" stroked="f"/>
+          <v:rect id="_x0000_i1036" style="width:0;height:1.5pt" o:hralign="center" o:hrstd="t" o:hr="t" fillcolor="#a0a0a0" stroked="f"/>
         </w:pict>
       </w:r>
     </w:p>
     <w:p>
       <w:pPr>
-        <w:pStyle w:val="Heading3"/>
-        <w:rPr>
-          <w:lang w:val="en-GB"/>
-        </w:rPr>
-      </w:pPr>
-      <w:r>
-        <w:rPr>
+        <w:rPr>
+          <w:b/>
+          <w:bCs/>
+          <w:lang w:val="en-GB"/>
+        </w:rPr>
+      </w:pPr>
+      <w:r>
+        <w:rPr>
+          <w:b/>
+          <w:bCs/>
           <w:lang w:val="en-GB"/>
         </w:rPr>
         <w:t>Reflection</w:t>
@@ -1476,7 +1530,7 @@
           <w:lang w:val="en-GB"/>
         </w:rPr>
         <w:pict w14:anchorId="587030D6">
-          <v:rect id="_x0000_i1307" style="width:0;height:1.5pt" o:hralign="center" o:hrstd="t" o:hr="t" fillcolor="#a0a0a0" stroked="f"/>
+          <v:rect id="_x0000_i1037" style="width:0;height:1.5pt" o:hralign="center" o:hrstd="t" o:hr="t" fillcolor="#a0a0a0" stroked="f"/>
         </w:pict>
       </w:r>
     </w:p>
@@ -1581,19 +1635,22 @@
           <w:lang w:val="en-GB"/>
         </w:rPr>
         <w:pict w14:anchorId="630E7787">
-          <v:rect id="_x0000_i1308" style="width:0;height:1.5pt" o:hralign="center" o:hrstd="t" o:hr="t" fillcolor="#a0a0a0" stroked="f"/>
+          <v:rect id="_x0000_i1038" style="width:0;height:1.5pt" o:hralign="center" o:hrstd="t" o:hr="t" fillcolor="#a0a0a0" stroked="f"/>
         </w:pict>
       </w:r>
     </w:p>
     <w:p>
       <w:pPr>
-        <w:pStyle w:val="Heading3"/>
-        <w:rPr>
-          <w:lang w:val="en-GB"/>
-        </w:rPr>
-      </w:pPr>
-      <w:r>
-        <w:rPr>
+        <w:rPr>
+          <w:b/>
+          <w:bCs/>
+          <w:lang w:val="en-GB"/>
+        </w:rPr>
+      </w:pPr>
+      <w:r>
+        <w:rPr>
+          <w:b/>
+          <w:bCs/>
           <w:lang w:val="en-GB"/>
         </w:rPr>
         <w:t>What I Can Now Do</w:t>
@@ -1643,19 +1700,22 @@
           <w:lang w:val="en-GB"/>
         </w:rPr>
         <w:pict w14:anchorId="3D0C6490">
-          <v:rect id="_x0000_i1309" style="width:0;height:1.5pt" o:hralign="center" o:hrstd="t" o:hr="t" fillcolor="#a0a0a0" stroked="f"/>
+          <v:rect id="_x0000_i1039" style="width:0;height:1.5pt" o:hralign="center" o:hrstd="t" o:hr="t" fillcolor="#a0a0a0" stroked="f"/>
         </w:pict>
       </w:r>
     </w:p>
     <w:p>
       <w:pPr>
-        <w:pStyle w:val="Heading3"/>
-        <w:rPr>
-          <w:lang w:val="en-GB"/>
-        </w:rPr>
-      </w:pPr>
-      <w:r>
-        <w:rPr>
+        <w:rPr>
+          <w:b/>
+          <w:bCs/>
+          <w:lang w:val="en-GB"/>
+        </w:rPr>
+      </w:pPr>
+      <w:r>
+        <w:rPr>
+          <w:b/>
+          <w:bCs/>
           <w:lang w:val="en-GB"/>
         </w:rPr>
         <w:t>How I Will Know This Worked</w:t>
@@ -1687,6 +1747,20 @@
         </w:rPr>
         <w:t>, enabling a direct comparison of answer quality.</w:t>
       </w:r>
+    </w:p>
+    <w:p>
+      <w:pPr>
+        <w:rPr>
+          <w:lang w:val="en-GB"/>
+        </w:rPr>
+      </w:pPr>
+    </w:p>
+    <w:p>
+      <w:pPr>
+        <w:rPr>
+          <w:lang w:val="en-GB"/>
+        </w:rPr>
+      </w:pPr>
     </w:p>
     <w:p>
       <w:pPr>
@@ -1875,6 +1949,1049 @@
       </w:pPr>
       <w:rPr>
         <w:rFonts w:ascii="Symbol" w:hAnsi="Symbol" w:hint="default"/>
+      </w:rPr>
+    </w:lvl>
+  </w:abstractNum>
+  <w:abstractNum w:abstractNumId="9" w15:restartNumberingAfterBreak="0">
+    <w:nsid w:val="1B3C0F3A"/>
+    <w:multiLevelType w:val="multilevel"/>
+    <w:tmpl w:val="A2D42DCC"/>
+    <w:lvl w:ilvl="0">
+      <w:start w:val="1"/>
+      <w:numFmt w:val="bullet"/>
+      <w:lvlText w:val=""/>
+      <w:lvlJc w:val="left"/>
+      <w:pPr>
+        <w:tabs>
+          <w:tab w:val="num" w:pos="720"/>
+        </w:tabs>
+        <w:ind w:left="720" w:hanging="360"/>
+      </w:pPr>
+      <w:rPr>
+        <w:rFonts w:ascii="Symbol" w:hAnsi="Symbol" w:hint="default"/>
+        <w:sz w:val="20"/>
+      </w:rPr>
+    </w:lvl>
+    <w:lvl w:ilvl="1" w:tentative="1">
+      <w:start w:val="1"/>
+      <w:numFmt w:val="bullet"/>
+      <w:lvlText w:val="o"/>
+      <w:lvlJc w:val="left"/>
+      <w:pPr>
+        <w:tabs>
+          <w:tab w:val="num" w:pos="1440"/>
+        </w:tabs>
+        <w:ind w:left="1440" w:hanging="360"/>
+      </w:pPr>
+      <w:rPr>
+        <w:rFonts w:ascii="Courier New" w:hAnsi="Courier New" w:hint="default"/>
+        <w:sz w:val="20"/>
+      </w:rPr>
+    </w:lvl>
+    <w:lvl w:ilvl="2" w:tentative="1">
+      <w:start w:val="1"/>
+      <w:numFmt w:val="bullet"/>
+      <w:lvlText w:val=""/>
+      <w:lvlJc w:val="left"/>
+      <w:pPr>
+        <w:tabs>
+          <w:tab w:val="num" w:pos="2160"/>
+        </w:tabs>
+        <w:ind w:left="2160" w:hanging="360"/>
+      </w:pPr>
+      <w:rPr>
+        <w:rFonts w:ascii="Wingdings" w:hAnsi="Wingdings" w:hint="default"/>
+        <w:sz w:val="20"/>
+      </w:rPr>
+    </w:lvl>
+    <w:lvl w:ilvl="3" w:tentative="1">
+      <w:start w:val="1"/>
+      <w:numFmt w:val="bullet"/>
+      <w:lvlText w:val=""/>
+      <w:lvlJc w:val="left"/>
+      <w:pPr>
+        <w:tabs>
+          <w:tab w:val="num" w:pos="2880"/>
+        </w:tabs>
+        <w:ind w:left="2880" w:hanging="360"/>
+      </w:pPr>
+      <w:rPr>
+        <w:rFonts w:ascii="Wingdings" w:hAnsi="Wingdings" w:hint="default"/>
+        <w:sz w:val="20"/>
+      </w:rPr>
+    </w:lvl>
+    <w:lvl w:ilvl="4" w:tentative="1">
+      <w:start w:val="1"/>
+      <w:numFmt w:val="bullet"/>
+      <w:lvlText w:val=""/>
+      <w:lvlJc w:val="left"/>
+      <w:pPr>
+        <w:tabs>
+          <w:tab w:val="num" w:pos="3600"/>
+        </w:tabs>
+        <w:ind w:left="3600" w:hanging="360"/>
+      </w:pPr>
+      <w:rPr>
+        <w:rFonts w:ascii="Wingdings" w:hAnsi="Wingdings" w:hint="default"/>
+        <w:sz w:val="20"/>
+      </w:rPr>
+    </w:lvl>
+    <w:lvl w:ilvl="5" w:tentative="1">
+      <w:start w:val="1"/>
+      <w:numFmt w:val="bullet"/>
+      <w:lvlText w:val=""/>
+      <w:lvlJc w:val="left"/>
+      <w:pPr>
+        <w:tabs>
+          <w:tab w:val="num" w:pos="4320"/>
+        </w:tabs>
+        <w:ind w:left="4320" w:hanging="360"/>
+      </w:pPr>
+      <w:rPr>
+        <w:rFonts w:ascii="Wingdings" w:hAnsi="Wingdings" w:hint="default"/>
+        <w:sz w:val="20"/>
+      </w:rPr>
+    </w:lvl>
+    <w:lvl w:ilvl="6" w:tentative="1">
+      <w:start w:val="1"/>
+      <w:numFmt w:val="bullet"/>
+      <w:lvlText w:val=""/>
+      <w:lvlJc w:val="left"/>
+      <w:pPr>
+        <w:tabs>
+          <w:tab w:val="num" w:pos="5040"/>
+        </w:tabs>
+        <w:ind w:left="5040" w:hanging="360"/>
+      </w:pPr>
+      <w:rPr>
+        <w:rFonts w:ascii="Wingdings" w:hAnsi="Wingdings" w:hint="default"/>
+        <w:sz w:val="20"/>
+      </w:rPr>
+    </w:lvl>
+    <w:lvl w:ilvl="7" w:tentative="1">
+      <w:start w:val="1"/>
+      <w:numFmt w:val="bullet"/>
+      <w:lvlText w:val=""/>
+      <w:lvlJc w:val="left"/>
+      <w:pPr>
+        <w:tabs>
+          <w:tab w:val="num" w:pos="5760"/>
+        </w:tabs>
+        <w:ind w:left="5760" w:hanging="360"/>
+      </w:pPr>
+      <w:rPr>
+        <w:rFonts w:ascii="Wingdings" w:hAnsi="Wingdings" w:hint="default"/>
+        <w:sz w:val="20"/>
+      </w:rPr>
+    </w:lvl>
+    <w:lvl w:ilvl="8" w:tentative="1">
+      <w:start w:val="1"/>
+      <w:numFmt w:val="bullet"/>
+      <w:lvlText w:val=""/>
+      <w:lvlJc w:val="left"/>
+      <w:pPr>
+        <w:tabs>
+          <w:tab w:val="num" w:pos="6480"/>
+        </w:tabs>
+        <w:ind w:left="6480" w:hanging="360"/>
+      </w:pPr>
+      <w:rPr>
+        <w:rFonts w:ascii="Wingdings" w:hAnsi="Wingdings" w:hint="default"/>
+        <w:sz w:val="20"/>
+      </w:rPr>
+    </w:lvl>
+  </w:abstractNum>
+  <w:abstractNum w:abstractNumId="10" w15:restartNumberingAfterBreak="0">
+    <w:nsid w:val="4A9E4F49"/>
+    <w:multiLevelType w:val="multilevel"/>
+    <w:tmpl w:val="C6F42CEA"/>
+    <w:lvl w:ilvl="0">
+      <w:start w:val="1"/>
+      <w:numFmt w:val="bullet"/>
+      <w:lvlText w:val=""/>
+      <w:lvlJc w:val="left"/>
+      <w:pPr>
+        <w:tabs>
+          <w:tab w:val="num" w:pos="720"/>
+        </w:tabs>
+        <w:ind w:left="720" w:hanging="360"/>
+      </w:pPr>
+      <w:rPr>
+        <w:rFonts w:ascii="Symbol" w:hAnsi="Symbol" w:hint="default"/>
+        <w:sz w:val="20"/>
+      </w:rPr>
+    </w:lvl>
+    <w:lvl w:ilvl="1" w:tentative="1">
+      <w:start w:val="1"/>
+      <w:numFmt w:val="bullet"/>
+      <w:lvlText w:val="o"/>
+      <w:lvlJc w:val="left"/>
+      <w:pPr>
+        <w:tabs>
+          <w:tab w:val="num" w:pos="1440"/>
+        </w:tabs>
+        <w:ind w:left="1440" w:hanging="360"/>
+      </w:pPr>
+      <w:rPr>
+        <w:rFonts w:ascii="Courier New" w:hAnsi="Courier New" w:hint="default"/>
+        <w:sz w:val="20"/>
+      </w:rPr>
+    </w:lvl>
+    <w:lvl w:ilvl="2" w:tentative="1">
+      <w:start w:val="1"/>
+      <w:numFmt w:val="bullet"/>
+      <w:lvlText w:val=""/>
+      <w:lvlJc w:val="left"/>
+      <w:pPr>
+        <w:tabs>
+          <w:tab w:val="num" w:pos="2160"/>
+        </w:tabs>
+        <w:ind w:left="2160" w:hanging="360"/>
+      </w:pPr>
+      <w:rPr>
+        <w:rFonts w:ascii="Wingdings" w:hAnsi="Wingdings" w:hint="default"/>
+        <w:sz w:val="20"/>
+      </w:rPr>
+    </w:lvl>
+    <w:lvl w:ilvl="3" w:tentative="1">
+      <w:start w:val="1"/>
+      <w:numFmt w:val="bullet"/>
+      <w:lvlText w:val=""/>
+      <w:lvlJc w:val="left"/>
+      <w:pPr>
+        <w:tabs>
+          <w:tab w:val="num" w:pos="2880"/>
+        </w:tabs>
+        <w:ind w:left="2880" w:hanging="360"/>
+      </w:pPr>
+      <w:rPr>
+        <w:rFonts w:ascii="Wingdings" w:hAnsi="Wingdings" w:hint="default"/>
+        <w:sz w:val="20"/>
+      </w:rPr>
+    </w:lvl>
+    <w:lvl w:ilvl="4" w:tentative="1">
+      <w:start w:val="1"/>
+      <w:numFmt w:val="bullet"/>
+      <w:lvlText w:val=""/>
+      <w:lvlJc w:val="left"/>
+      <w:pPr>
+        <w:tabs>
+          <w:tab w:val="num" w:pos="3600"/>
+        </w:tabs>
+        <w:ind w:left="3600" w:hanging="360"/>
+      </w:pPr>
+      <w:rPr>
+        <w:rFonts w:ascii="Wingdings" w:hAnsi="Wingdings" w:hint="default"/>
+        <w:sz w:val="20"/>
+      </w:rPr>
+    </w:lvl>
+    <w:lvl w:ilvl="5" w:tentative="1">
+      <w:start w:val="1"/>
+      <w:numFmt w:val="bullet"/>
+      <w:lvlText w:val=""/>
+      <w:lvlJc w:val="left"/>
+      <w:pPr>
+        <w:tabs>
+          <w:tab w:val="num" w:pos="4320"/>
+        </w:tabs>
+        <w:ind w:left="4320" w:hanging="360"/>
+      </w:pPr>
+      <w:rPr>
+        <w:rFonts w:ascii="Wingdings" w:hAnsi="Wingdings" w:hint="default"/>
+        <w:sz w:val="20"/>
+      </w:rPr>
+    </w:lvl>
+    <w:lvl w:ilvl="6" w:tentative="1">
+      <w:start w:val="1"/>
+      <w:numFmt w:val="bullet"/>
+      <w:lvlText w:val=""/>
+      <w:lvlJc w:val="left"/>
+      <w:pPr>
+        <w:tabs>
+          <w:tab w:val="num" w:pos="5040"/>
+        </w:tabs>
+        <w:ind w:left="5040" w:hanging="360"/>
+      </w:pPr>
+      <w:rPr>
+        <w:rFonts w:ascii="Wingdings" w:hAnsi="Wingdings" w:hint="default"/>
+        <w:sz w:val="20"/>
+      </w:rPr>
+    </w:lvl>
+    <w:lvl w:ilvl="7" w:tentative="1">
+      <w:start w:val="1"/>
+      <w:numFmt w:val="bullet"/>
+      <w:lvlText w:val=""/>
+      <w:lvlJc w:val="left"/>
+      <w:pPr>
+        <w:tabs>
+          <w:tab w:val="num" w:pos="5760"/>
+        </w:tabs>
+        <w:ind w:left="5760" w:hanging="360"/>
+      </w:pPr>
+      <w:rPr>
+        <w:rFonts w:ascii="Wingdings" w:hAnsi="Wingdings" w:hint="default"/>
+        <w:sz w:val="20"/>
+      </w:rPr>
+    </w:lvl>
+    <w:lvl w:ilvl="8" w:tentative="1">
+      <w:start w:val="1"/>
+      <w:numFmt w:val="bullet"/>
+      <w:lvlText w:val=""/>
+      <w:lvlJc w:val="left"/>
+      <w:pPr>
+        <w:tabs>
+          <w:tab w:val="num" w:pos="6480"/>
+        </w:tabs>
+        <w:ind w:left="6480" w:hanging="360"/>
+      </w:pPr>
+      <w:rPr>
+        <w:rFonts w:ascii="Wingdings" w:hAnsi="Wingdings" w:hint="default"/>
+        <w:sz w:val="20"/>
+      </w:rPr>
+    </w:lvl>
+  </w:abstractNum>
+  <w:abstractNum w:abstractNumId="11" w15:restartNumberingAfterBreak="0">
+    <w:nsid w:val="5FC669BA"/>
+    <w:multiLevelType w:val="multilevel"/>
+    <w:tmpl w:val="9F46CFCA"/>
+    <w:lvl w:ilvl="0">
+      <w:start w:val="1"/>
+      <w:numFmt w:val="bullet"/>
+      <w:lvlText w:val=""/>
+      <w:lvlJc w:val="left"/>
+      <w:pPr>
+        <w:tabs>
+          <w:tab w:val="num" w:pos="720"/>
+        </w:tabs>
+        <w:ind w:left="720" w:hanging="360"/>
+      </w:pPr>
+      <w:rPr>
+        <w:rFonts w:ascii="Symbol" w:hAnsi="Symbol" w:hint="default"/>
+        <w:sz w:val="20"/>
+      </w:rPr>
+    </w:lvl>
+    <w:lvl w:ilvl="1" w:tentative="1">
+      <w:start w:val="1"/>
+      <w:numFmt w:val="bullet"/>
+      <w:lvlText w:val="o"/>
+      <w:lvlJc w:val="left"/>
+      <w:pPr>
+        <w:tabs>
+          <w:tab w:val="num" w:pos="1440"/>
+        </w:tabs>
+        <w:ind w:left="1440" w:hanging="360"/>
+      </w:pPr>
+      <w:rPr>
+        <w:rFonts w:ascii="Courier New" w:hAnsi="Courier New" w:hint="default"/>
+        <w:sz w:val="20"/>
+      </w:rPr>
+    </w:lvl>
+    <w:lvl w:ilvl="2" w:tentative="1">
+      <w:start w:val="1"/>
+      <w:numFmt w:val="bullet"/>
+      <w:lvlText w:val=""/>
+      <w:lvlJc w:val="left"/>
+      <w:pPr>
+        <w:tabs>
+          <w:tab w:val="num" w:pos="2160"/>
+        </w:tabs>
+        <w:ind w:left="2160" w:hanging="360"/>
+      </w:pPr>
+      <w:rPr>
+        <w:rFonts w:ascii="Wingdings" w:hAnsi="Wingdings" w:hint="default"/>
+        <w:sz w:val="20"/>
+      </w:rPr>
+    </w:lvl>
+    <w:lvl w:ilvl="3" w:tentative="1">
+      <w:start w:val="1"/>
+      <w:numFmt w:val="bullet"/>
+      <w:lvlText w:val=""/>
+      <w:lvlJc w:val="left"/>
+      <w:pPr>
+        <w:tabs>
+          <w:tab w:val="num" w:pos="2880"/>
+        </w:tabs>
+        <w:ind w:left="2880" w:hanging="360"/>
+      </w:pPr>
+      <w:rPr>
+        <w:rFonts w:ascii="Wingdings" w:hAnsi="Wingdings" w:hint="default"/>
+        <w:sz w:val="20"/>
+      </w:rPr>
+    </w:lvl>
+    <w:lvl w:ilvl="4" w:tentative="1">
+      <w:start w:val="1"/>
+      <w:numFmt w:val="bullet"/>
+      <w:lvlText w:val=""/>
+      <w:lvlJc w:val="left"/>
+      <w:pPr>
+        <w:tabs>
+          <w:tab w:val="num" w:pos="3600"/>
+        </w:tabs>
+        <w:ind w:left="3600" w:hanging="360"/>
+      </w:pPr>
+      <w:rPr>
+        <w:rFonts w:ascii="Wingdings" w:hAnsi="Wingdings" w:hint="default"/>
+        <w:sz w:val="20"/>
+      </w:rPr>
+    </w:lvl>
+    <w:lvl w:ilvl="5" w:tentative="1">
+      <w:start w:val="1"/>
+      <w:numFmt w:val="bullet"/>
+      <w:lvlText w:val=""/>
+      <w:lvlJc w:val="left"/>
+      <w:pPr>
+        <w:tabs>
+          <w:tab w:val="num" w:pos="4320"/>
+        </w:tabs>
+        <w:ind w:left="4320" w:hanging="360"/>
+      </w:pPr>
+      <w:rPr>
+        <w:rFonts w:ascii="Wingdings" w:hAnsi="Wingdings" w:hint="default"/>
+        <w:sz w:val="20"/>
+      </w:rPr>
+    </w:lvl>
+    <w:lvl w:ilvl="6" w:tentative="1">
+      <w:start w:val="1"/>
+      <w:numFmt w:val="bullet"/>
+      <w:lvlText w:val=""/>
+      <w:lvlJc w:val="left"/>
+      <w:pPr>
+        <w:tabs>
+          <w:tab w:val="num" w:pos="5040"/>
+        </w:tabs>
+        <w:ind w:left="5040" w:hanging="360"/>
+      </w:pPr>
+      <w:rPr>
+        <w:rFonts w:ascii="Wingdings" w:hAnsi="Wingdings" w:hint="default"/>
+        <w:sz w:val="20"/>
+      </w:rPr>
+    </w:lvl>
+    <w:lvl w:ilvl="7" w:tentative="1">
+      <w:start w:val="1"/>
+      <w:numFmt w:val="bullet"/>
+      <w:lvlText w:val=""/>
+      <w:lvlJc w:val="left"/>
+      <w:pPr>
+        <w:tabs>
+          <w:tab w:val="num" w:pos="5760"/>
+        </w:tabs>
+        <w:ind w:left="5760" w:hanging="360"/>
+      </w:pPr>
+      <w:rPr>
+        <w:rFonts w:ascii="Wingdings" w:hAnsi="Wingdings" w:hint="default"/>
+        <w:sz w:val="20"/>
+      </w:rPr>
+    </w:lvl>
+    <w:lvl w:ilvl="8" w:tentative="1">
+      <w:start w:val="1"/>
+      <w:numFmt w:val="bullet"/>
+      <w:lvlText w:val=""/>
+      <w:lvlJc w:val="left"/>
+      <w:pPr>
+        <w:tabs>
+          <w:tab w:val="num" w:pos="6480"/>
+        </w:tabs>
+        <w:ind w:left="6480" w:hanging="360"/>
+      </w:pPr>
+      <w:rPr>
+        <w:rFonts w:ascii="Wingdings" w:hAnsi="Wingdings" w:hint="default"/>
+        <w:sz w:val="20"/>
+      </w:rPr>
+    </w:lvl>
+  </w:abstractNum>
+  <w:abstractNum w:abstractNumId="12" w15:restartNumberingAfterBreak="0">
+    <w:nsid w:val="61C51B16"/>
+    <w:multiLevelType w:val="multilevel"/>
+    <w:tmpl w:val="A3663160"/>
+    <w:lvl w:ilvl="0">
+      <w:start w:val="1"/>
+      <w:numFmt w:val="bullet"/>
+      <w:lvlText w:val=""/>
+      <w:lvlJc w:val="left"/>
+      <w:pPr>
+        <w:tabs>
+          <w:tab w:val="num" w:pos="720"/>
+        </w:tabs>
+        <w:ind w:left="720" w:hanging="360"/>
+      </w:pPr>
+      <w:rPr>
+        <w:rFonts w:ascii="Symbol" w:hAnsi="Symbol" w:hint="default"/>
+        <w:sz w:val="20"/>
+      </w:rPr>
+    </w:lvl>
+    <w:lvl w:ilvl="1" w:tentative="1">
+      <w:start w:val="1"/>
+      <w:numFmt w:val="bullet"/>
+      <w:lvlText w:val="o"/>
+      <w:lvlJc w:val="left"/>
+      <w:pPr>
+        <w:tabs>
+          <w:tab w:val="num" w:pos="1440"/>
+        </w:tabs>
+        <w:ind w:left="1440" w:hanging="360"/>
+      </w:pPr>
+      <w:rPr>
+        <w:rFonts w:ascii="Courier New" w:hAnsi="Courier New" w:hint="default"/>
+        <w:sz w:val="20"/>
+      </w:rPr>
+    </w:lvl>
+    <w:lvl w:ilvl="2" w:tentative="1">
+      <w:start w:val="1"/>
+      <w:numFmt w:val="bullet"/>
+      <w:lvlText w:val=""/>
+      <w:lvlJc w:val="left"/>
+      <w:pPr>
+        <w:tabs>
+          <w:tab w:val="num" w:pos="2160"/>
+        </w:tabs>
+        <w:ind w:left="2160" w:hanging="360"/>
+      </w:pPr>
+      <w:rPr>
+        <w:rFonts w:ascii="Wingdings" w:hAnsi="Wingdings" w:hint="default"/>
+        <w:sz w:val="20"/>
+      </w:rPr>
+    </w:lvl>
+    <w:lvl w:ilvl="3" w:tentative="1">
+      <w:start w:val="1"/>
+      <w:numFmt w:val="bullet"/>
+      <w:lvlText w:val=""/>
+      <w:lvlJc w:val="left"/>
+      <w:pPr>
+        <w:tabs>
+          <w:tab w:val="num" w:pos="2880"/>
+        </w:tabs>
+        <w:ind w:left="2880" w:hanging="360"/>
+      </w:pPr>
+      <w:rPr>
+        <w:rFonts w:ascii="Wingdings" w:hAnsi="Wingdings" w:hint="default"/>
+        <w:sz w:val="20"/>
+      </w:rPr>
+    </w:lvl>
+    <w:lvl w:ilvl="4" w:tentative="1">
+      <w:start w:val="1"/>
+      <w:numFmt w:val="bullet"/>
+      <w:lvlText w:val=""/>
+      <w:lvlJc w:val="left"/>
+      <w:pPr>
+        <w:tabs>
+          <w:tab w:val="num" w:pos="3600"/>
+        </w:tabs>
+        <w:ind w:left="3600" w:hanging="360"/>
+      </w:pPr>
+      <w:rPr>
+        <w:rFonts w:ascii="Wingdings" w:hAnsi="Wingdings" w:hint="default"/>
+        <w:sz w:val="20"/>
+      </w:rPr>
+    </w:lvl>
+    <w:lvl w:ilvl="5" w:tentative="1">
+      <w:start w:val="1"/>
+      <w:numFmt w:val="bullet"/>
+      <w:lvlText w:val=""/>
+      <w:lvlJc w:val="left"/>
+      <w:pPr>
+        <w:tabs>
+          <w:tab w:val="num" w:pos="4320"/>
+        </w:tabs>
+        <w:ind w:left="4320" w:hanging="360"/>
+      </w:pPr>
+      <w:rPr>
+        <w:rFonts w:ascii="Wingdings" w:hAnsi="Wingdings" w:hint="default"/>
+        <w:sz w:val="20"/>
+      </w:rPr>
+    </w:lvl>
+    <w:lvl w:ilvl="6" w:tentative="1">
+      <w:start w:val="1"/>
+      <w:numFmt w:val="bullet"/>
+      <w:lvlText w:val=""/>
+      <w:lvlJc w:val="left"/>
+      <w:pPr>
+        <w:tabs>
+          <w:tab w:val="num" w:pos="5040"/>
+        </w:tabs>
+        <w:ind w:left="5040" w:hanging="360"/>
+      </w:pPr>
+      <w:rPr>
+        <w:rFonts w:ascii="Wingdings" w:hAnsi="Wingdings" w:hint="default"/>
+        <w:sz w:val="20"/>
+      </w:rPr>
+    </w:lvl>
+    <w:lvl w:ilvl="7" w:tentative="1">
+      <w:start w:val="1"/>
+      <w:numFmt w:val="bullet"/>
+      <w:lvlText w:val=""/>
+      <w:lvlJc w:val="left"/>
+      <w:pPr>
+        <w:tabs>
+          <w:tab w:val="num" w:pos="5760"/>
+        </w:tabs>
+        <w:ind w:left="5760" w:hanging="360"/>
+      </w:pPr>
+      <w:rPr>
+        <w:rFonts w:ascii="Wingdings" w:hAnsi="Wingdings" w:hint="default"/>
+        <w:sz w:val="20"/>
+      </w:rPr>
+    </w:lvl>
+    <w:lvl w:ilvl="8" w:tentative="1">
+      <w:start w:val="1"/>
+      <w:numFmt w:val="bullet"/>
+      <w:lvlText w:val=""/>
+      <w:lvlJc w:val="left"/>
+      <w:pPr>
+        <w:tabs>
+          <w:tab w:val="num" w:pos="6480"/>
+        </w:tabs>
+        <w:ind w:left="6480" w:hanging="360"/>
+      </w:pPr>
+      <w:rPr>
+        <w:rFonts w:ascii="Wingdings" w:hAnsi="Wingdings" w:hint="default"/>
+        <w:sz w:val="20"/>
+      </w:rPr>
+    </w:lvl>
+  </w:abstractNum>
+  <w:abstractNum w:abstractNumId="13" w15:restartNumberingAfterBreak="0">
+    <w:nsid w:val="6F8F059E"/>
+    <w:multiLevelType w:val="multilevel"/>
+    <w:tmpl w:val="6B7E5D5C"/>
+    <w:lvl w:ilvl="0">
+      <w:start w:val="1"/>
+      <w:numFmt w:val="bullet"/>
+      <w:lvlText w:val=""/>
+      <w:lvlJc w:val="left"/>
+      <w:pPr>
+        <w:tabs>
+          <w:tab w:val="num" w:pos="720"/>
+        </w:tabs>
+        <w:ind w:left="720" w:hanging="360"/>
+      </w:pPr>
+      <w:rPr>
+        <w:rFonts w:ascii="Symbol" w:hAnsi="Symbol" w:hint="default"/>
+        <w:sz w:val="20"/>
+      </w:rPr>
+    </w:lvl>
+    <w:lvl w:ilvl="1" w:tentative="1">
+      <w:start w:val="1"/>
+      <w:numFmt w:val="bullet"/>
+      <w:lvlText w:val="o"/>
+      <w:lvlJc w:val="left"/>
+      <w:pPr>
+        <w:tabs>
+          <w:tab w:val="num" w:pos="1440"/>
+        </w:tabs>
+        <w:ind w:left="1440" w:hanging="360"/>
+      </w:pPr>
+      <w:rPr>
+        <w:rFonts w:ascii="Courier New" w:hAnsi="Courier New" w:hint="default"/>
+        <w:sz w:val="20"/>
+      </w:rPr>
+    </w:lvl>
+    <w:lvl w:ilvl="2" w:tentative="1">
+      <w:start w:val="1"/>
+      <w:numFmt w:val="bullet"/>
+      <w:lvlText w:val=""/>
+      <w:lvlJc w:val="left"/>
+      <w:pPr>
+        <w:tabs>
+          <w:tab w:val="num" w:pos="2160"/>
+        </w:tabs>
+        <w:ind w:left="2160" w:hanging="360"/>
+      </w:pPr>
+      <w:rPr>
+        <w:rFonts w:ascii="Wingdings" w:hAnsi="Wingdings" w:hint="default"/>
+        <w:sz w:val="20"/>
+      </w:rPr>
+    </w:lvl>
+    <w:lvl w:ilvl="3" w:tentative="1">
+      <w:start w:val="1"/>
+      <w:numFmt w:val="bullet"/>
+      <w:lvlText w:val=""/>
+      <w:lvlJc w:val="left"/>
+      <w:pPr>
+        <w:tabs>
+          <w:tab w:val="num" w:pos="2880"/>
+        </w:tabs>
+        <w:ind w:left="2880" w:hanging="360"/>
+      </w:pPr>
+      <w:rPr>
+        <w:rFonts w:ascii="Wingdings" w:hAnsi="Wingdings" w:hint="default"/>
+        <w:sz w:val="20"/>
+      </w:rPr>
+    </w:lvl>
+    <w:lvl w:ilvl="4" w:tentative="1">
+      <w:start w:val="1"/>
+      <w:numFmt w:val="bullet"/>
+      <w:lvlText w:val=""/>
+      <w:lvlJc w:val="left"/>
+      <w:pPr>
+        <w:tabs>
+          <w:tab w:val="num" w:pos="3600"/>
+        </w:tabs>
+        <w:ind w:left="3600" w:hanging="360"/>
+      </w:pPr>
+      <w:rPr>
+        <w:rFonts w:ascii="Wingdings" w:hAnsi="Wingdings" w:hint="default"/>
+        <w:sz w:val="20"/>
+      </w:rPr>
+    </w:lvl>
+    <w:lvl w:ilvl="5" w:tentative="1">
+      <w:start w:val="1"/>
+      <w:numFmt w:val="bullet"/>
+      <w:lvlText w:val=""/>
+      <w:lvlJc w:val="left"/>
+      <w:pPr>
+        <w:tabs>
+          <w:tab w:val="num" w:pos="4320"/>
+        </w:tabs>
+        <w:ind w:left="4320" w:hanging="360"/>
+      </w:pPr>
+      <w:rPr>
+        <w:rFonts w:ascii="Wingdings" w:hAnsi="Wingdings" w:hint="default"/>
+        <w:sz w:val="20"/>
+      </w:rPr>
+    </w:lvl>
+    <w:lvl w:ilvl="6" w:tentative="1">
+      <w:start w:val="1"/>
+      <w:numFmt w:val="bullet"/>
+      <w:lvlText w:val=""/>
+      <w:lvlJc w:val="left"/>
+      <w:pPr>
+        <w:tabs>
+          <w:tab w:val="num" w:pos="5040"/>
+        </w:tabs>
+        <w:ind w:left="5040" w:hanging="360"/>
+      </w:pPr>
+      <w:rPr>
+        <w:rFonts w:ascii="Wingdings" w:hAnsi="Wingdings" w:hint="default"/>
+        <w:sz w:val="20"/>
+      </w:rPr>
+    </w:lvl>
+    <w:lvl w:ilvl="7" w:tentative="1">
+      <w:start w:val="1"/>
+      <w:numFmt w:val="bullet"/>
+      <w:lvlText w:val=""/>
+      <w:lvlJc w:val="left"/>
+      <w:pPr>
+        <w:tabs>
+          <w:tab w:val="num" w:pos="5760"/>
+        </w:tabs>
+        <w:ind w:left="5760" w:hanging="360"/>
+      </w:pPr>
+      <w:rPr>
+        <w:rFonts w:ascii="Wingdings" w:hAnsi="Wingdings" w:hint="default"/>
+        <w:sz w:val="20"/>
+      </w:rPr>
+    </w:lvl>
+    <w:lvl w:ilvl="8" w:tentative="1">
+      <w:start w:val="1"/>
+      <w:numFmt w:val="bullet"/>
+      <w:lvlText w:val=""/>
+      <w:lvlJc w:val="left"/>
+      <w:pPr>
+        <w:tabs>
+          <w:tab w:val="num" w:pos="6480"/>
+        </w:tabs>
+        <w:ind w:left="6480" w:hanging="360"/>
+      </w:pPr>
+      <w:rPr>
+        <w:rFonts w:ascii="Wingdings" w:hAnsi="Wingdings" w:hint="default"/>
+        <w:sz w:val="20"/>
+      </w:rPr>
+    </w:lvl>
+  </w:abstractNum>
+  <w:abstractNum w:abstractNumId="14" w15:restartNumberingAfterBreak="0">
+    <w:nsid w:val="74BC2036"/>
+    <w:multiLevelType w:val="multilevel"/>
+    <w:tmpl w:val="E0EEAA44"/>
+    <w:lvl w:ilvl="0">
+      <w:start w:val="1"/>
+      <w:numFmt w:val="bullet"/>
+      <w:lvlText w:val=""/>
+      <w:lvlJc w:val="left"/>
+      <w:pPr>
+        <w:tabs>
+          <w:tab w:val="num" w:pos="720"/>
+        </w:tabs>
+        <w:ind w:left="720" w:hanging="360"/>
+      </w:pPr>
+      <w:rPr>
+        <w:rFonts w:ascii="Symbol" w:hAnsi="Symbol" w:hint="default"/>
+        <w:sz w:val="20"/>
+      </w:rPr>
+    </w:lvl>
+    <w:lvl w:ilvl="1" w:tentative="1">
+      <w:start w:val="1"/>
+      <w:numFmt w:val="bullet"/>
+      <w:lvlText w:val="o"/>
+      <w:lvlJc w:val="left"/>
+      <w:pPr>
+        <w:tabs>
+          <w:tab w:val="num" w:pos="1440"/>
+        </w:tabs>
+        <w:ind w:left="1440" w:hanging="360"/>
+      </w:pPr>
+      <w:rPr>
+        <w:rFonts w:ascii="Courier New" w:hAnsi="Courier New" w:hint="default"/>
+        <w:sz w:val="20"/>
+      </w:rPr>
+    </w:lvl>
+    <w:lvl w:ilvl="2" w:tentative="1">
+      <w:start w:val="1"/>
+      <w:numFmt w:val="bullet"/>
+      <w:lvlText w:val=""/>
+      <w:lvlJc w:val="left"/>
+      <w:pPr>
+        <w:tabs>
+          <w:tab w:val="num" w:pos="2160"/>
+        </w:tabs>
+        <w:ind w:left="2160" w:hanging="360"/>
+      </w:pPr>
+      <w:rPr>
+        <w:rFonts w:ascii="Wingdings" w:hAnsi="Wingdings" w:hint="default"/>
+        <w:sz w:val="20"/>
+      </w:rPr>
+    </w:lvl>
+    <w:lvl w:ilvl="3" w:tentative="1">
+      <w:start w:val="1"/>
+      <w:numFmt w:val="bullet"/>
+      <w:lvlText w:val=""/>
+      <w:lvlJc w:val="left"/>
+      <w:pPr>
+        <w:tabs>
+          <w:tab w:val="num" w:pos="2880"/>
+        </w:tabs>
+        <w:ind w:left="2880" w:hanging="360"/>
+      </w:pPr>
+      <w:rPr>
+        <w:rFonts w:ascii="Wingdings" w:hAnsi="Wingdings" w:hint="default"/>
+        <w:sz w:val="20"/>
+      </w:rPr>
+    </w:lvl>
+    <w:lvl w:ilvl="4" w:tentative="1">
+      <w:start w:val="1"/>
+      <w:numFmt w:val="bullet"/>
+      <w:lvlText w:val=""/>
+      <w:lvlJc w:val="left"/>
+      <w:pPr>
+        <w:tabs>
+          <w:tab w:val="num" w:pos="3600"/>
+        </w:tabs>
+        <w:ind w:left="3600" w:hanging="360"/>
+      </w:pPr>
+      <w:rPr>
+        <w:rFonts w:ascii="Wingdings" w:hAnsi="Wingdings" w:hint="default"/>
+        <w:sz w:val="20"/>
+      </w:rPr>
+    </w:lvl>
+    <w:lvl w:ilvl="5" w:tentative="1">
+      <w:start w:val="1"/>
+      <w:numFmt w:val="bullet"/>
+      <w:lvlText w:val=""/>
+      <w:lvlJc w:val="left"/>
+      <w:pPr>
+        <w:tabs>
+          <w:tab w:val="num" w:pos="4320"/>
+        </w:tabs>
+        <w:ind w:left="4320" w:hanging="360"/>
+      </w:pPr>
+      <w:rPr>
+        <w:rFonts w:ascii="Wingdings" w:hAnsi="Wingdings" w:hint="default"/>
+        <w:sz w:val="20"/>
+      </w:rPr>
+    </w:lvl>
+    <w:lvl w:ilvl="6" w:tentative="1">
+      <w:start w:val="1"/>
+      <w:numFmt w:val="bullet"/>
+      <w:lvlText w:val=""/>
+      <w:lvlJc w:val="left"/>
+      <w:pPr>
+        <w:tabs>
+          <w:tab w:val="num" w:pos="5040"/>
+        </w:tabs>
+        <w:ind w:left="5040" w:hanging="360"/>
+      </w:pPr>
+      <w:rPr>
+        <w:rFonts w:ascii="Wingdings" w:hAnsi="Wingdings" w:hint="default"/>
+        <w:sz w:val="20"/>
+      </w:rPr>
+    </w:lvl>
+    <w:lvl w:ilvl="7" w:tentative="1">
+      <w:start w:val="1"/>
+      <w:numFmt w:val="bullet"/>
+      <w:lvlText w:val=""/>
+      <w:lvlJc w:val="left"/>
+      <w:pPr>
+        <w:tabs>
+          <w:tab w:val="num" w:pos="5760"/>
+        </w:tabs>
+        <w:ind w:left="5760" w:hanging="360"/>
+      </w:pPr>
+      <w:rPr>
+        <w:rFonts w:ascii="Wingdings" w:hAnsi="Wingdings" w:hint="default"/>
+        <w:sz w:val="20"/>
+      </w:rPr>
+    </w:lvl>
+    <w:lvl w:ilvl="8" w:tentative="1">
+      <w:start w:val="1"/>
+      <w:numFmt w:val="bullet"/>
+      <w:lvlText w:val=""/>
+      <w:lvlJc w:val="left"/>
+      <w:pPr>
+        <w:tabs>
+          <w:tab w:val="num" w:pos="6480"/>
+        </w:tabs>
+        <w:ind w:left="6480" w:hanging="360"/>
+      </w:pPr>
+      <w:rPr>
+        <w:rFonts w:ascii="Wingdings" w:hAnsi="Wingdings" w:hint="default"/>
+        <w:sz w:val="20"/>
+      </w:rPr>
+    </w:lvl>
+  </w:abstractNum>
+  <w:abstractNum w:abstractNumId="15" w15:restartNumberingAfterBreak="0">
+    <w:nsid w:val="77C46D79"/>
+    <w:multiLevelType w:val="multilevel"/>
+    <w:tmpl w:val="285EF432"/>
+    <w:lvl w:ilvl="0">
+      <w:start w:val="1"/>
+      <w:numFmt w:val="bullet"/>
+      <w:lvlText w:val=""/>
+      <w:lvlJc w:val="left"/>
+      <w:pPr>
+        <w:tabs>
+          <w:tab w:val="num" w:pos="720"/>
+        </w:tabs>
+        <w:ind w:left="720" w:hanging="360"/>
+      </w:pPr>
+      <w:rPr>
+        <w:rFonts w:ascii="Symbol" w:hAnsi="Symbol" w:hint="default"/>
+        <w:sz w:val="20"/>
+      </w:rPr>
+    </w:lvl>
+    <w:lvl w:ilvl="1" w:tentative="1">
+      <w:start w:val="1"/>
+      <w:numFmt w:val="bullet"/>
+      <w:lvlText w:val="o"/>
+      <w:lvlJc w:val="left"/>
+      <w:pPr>
+        <w:tabs>
+          <w:tab w:val="num" w:pos="1440"/>
+        </w:tabs>
+        <w:ind w:left="1440" w:hanging="360"/>
+      </w:pPr>
+      <w:rPr>
+        <w:rFonts w:ascii="Courier New" w:hAnsi="Courier New" w:hint="default"/>
+        <w:sz w:val="20"/>
+      </w:rPr>
+    </w:lvl>
+    <w:lvl w:ilvl="2" w:tentative="1">
+      <w:start w:val="1"/>
+      <w:numFmt w:val="bullet"/>
+      <w:lvlText w:val=""/>
+      <w:lvlJc w:val="left"/>
+      <w:pPr>
+        <w:tabs>
+          <w:tab w:val="num" w:pos="2160"/>
+        </w:tabs>
+        <w:ind w:left="2160" w:hanging="360"/>
+      </w:pPr>
+      <w:rPr>
+        <w:rFonts w:ascii="Wingdings" w:hAnsi="Wingdings" w:hint="default"/>
+        <w:sz w:val="20"/>
+      </w:rPr>
+    </w:lvl>
+    <w:lvl w:ilvl="3" w:tentative="1">
+      <w:start w:val="1"/>
+      <w:numFmt w:val="bullet"/>
+      <w:lvlText w:val=""/>
+      <w:lvlJc w:val="left"/>
+      <w:pPr>
+        <w:tabs>
+          <w:tab w:val="num" w:pos="2880"/>
+        </w:tabs>
+        <w:ind w:left="2880" w:hanging="360"/>
+      </w:pPr>
+      <w:rPr>
+        <w:rFonts w:ascii="Wingdings" w:hAnsi="Wingdings" w:hint="default"/>
+        <w:sz w:val="20"/>
+      </w:rPr>
+    </w:lvl>
+    <w:lvl w:ilvl="4" w:tentative="1">
+      <w:start w:val="1"/>
+      <w:numFmt w:val="bullet"/>
+      <w:lvlText w:val=""/>
+      <w:lvlJc w:val="left"/>
+      <w:pPr>
+        <w:tabs>
+          <w:tab w:val="num" w:pos="3600"/>
+        </w:tabs>
+        <w:ind w:left="3600" w:hanging="360"/>
+      </w:pPr>
+      <w:rPr>
+        <w:rFonts w:ascii="Wingdings" w:hAnsi="Wingdings" w:hint="default"/>
+        <w:sz w:val="20"/>
+      </w:rPr>
+    </w:lvl>
+    <w:lvl w:ilvl="5" w:tentative="1">
+      <w:start w:val="1"/>
+      <w:numFmt w:val="bullet"/>
+      <w:lvlText w:val=""/>
+      <w:lvlJc w:val="left"/>
+      <w:pPr>
+        <w:tabs>
+          <w:tab w:val="num" w:pos="4320"/>
+        </w:tabs>
+        <w:ind w:left="4320" w:hanging="360"/>
+      </w:pPr>
+      <w:rPr>
+        <w:rFonts w:ascii="Wingdings" w:hAnsi="Wingdings" w:hint="default"/>
+        <w:sz w:val="20"/>
+      </w:rPr>
+    </w:lvl>
+    <w:lvl w:ilvl="6" w:tentative="1">
+      <w:start w:val="1"/>
+      <w:numFmt w:val="bullet"/>
+      <w:lvlText w:val=""/>
+      <w:lvlJc w:val="left"/>
+      <w:pPr>
+        <w:tabs>
+          <w:tab w:val="num" w:pos="5040"/>
+        </w:tabs>
+        <w:ind w:left="5040" w:hanging="360"/>
+      </w:pPr>
+      <w:rPr>
+        <w:rFonts w:ascii="Wingdings" w:hAnsi="Wingdings" w:hint="default"/>
+        <w:sz w:val="20"/>
+      </w:rPr>
+    </w:lvl>
+    <w:lvl w:ilvl="7" w:tentative="1">
+      <w:start w:val="1"/>
+      <w:numFmt w:val="bullet"/>
+      <w:lvlText w:val=""/>
+      <w:lvlJc w:val="left"/>
+      <w:pPr>
+        <w:tabs>
+          <w:tab w:val="num" w:pos="5760"/>
+        </w:tabs>
+        <w:ind w:left="5760" w:hanging="360"/>
+      </w:pPr>
+      <w:rPr>
+        <w:rFonts w:ascii="Wingdings" w:hAnsi="Wingdings" w:hint="default"/>
+        <w:sz w:val="20"/>
+      </w:rPr>
+    </w:lvl>
+    <w:lvl w:ilvl="8" w:tentative="1">
+      <w:start w:val="1"/>
+      <w:numFmt w:val="bullet"/>
+      <w:lvlText w:val=""/>
+      <w:lvlJc w:val="left"/>
+      <w:pPr>
+        <w:tabs>
+          <w:tab w:val="num" w:pos="6480"/>
+        </w:tabs>
+        <w:ind w:left="6480" w:hanging="360"/>
+      </w:pPr>
+      <w:rPr>
+        <w:rFonts w:ascii="Wingdings" w:hAnsi="Wingdings" w:hint="default"/>
+        <w:sz w:val="20"/>
       </w:rPr>
     </w:lvl>
   </w:abstractNum>
@@ -1904,6 +3021,27 @@
   </w:num>
   <w:num w:numId="9" w16cid:durableId="2094233209">
     <w:abstractNumId w:val="0"/>
+  </w:num>
+  <w:num w:numId="10" w16cid:durableId="1446921542">
+    <w:abstractNumId w:val="12"/>
+  </w:num>
+  <w:num w:numId="11" w16cid:durableId="1258441899">
+    <w:abstractNumId w:val="10"/>
+  </w:num>
+  <w:num w:numId="12" w16cid:durableId="884634723">
+    <w:abstractNumId w:val="14"/>
+  </w:num>
+  <w:num w:numId="13" w16cid:durableId="391199336">
+    <w:abstractNumId w:val="11"/>
+  </w:num>
+  <w:num w:numId="14" w16cid:durableId="1530027503">
+    <w:abstractNumId w:val="15"/>
+  </w:num>
+  <w:num w:numId="15" w16cid:durableId="1969966969">
+    <w:abstractNumId w:val="13"/>
+  </w:num>
+  <w:num w:numId="16" w16cid:durableId="942612982">
+    <w:abstractNumId w:val="9"/>
   </w:num>
 </w:numbering>
 </file>

</xml_diff>